<commit_message>
docs: journal test réel des decks + étape 2 (revenu, cohérence)
</commit_message>
<xml_diff>
--- a/Journal_de_bord.docx
+++ b/Journal_de_bord.docx
@@ -19,6 +19,240 @@
       </w:r>
     </w:p>
     <w:p/>
+    <w:p>
+      <w:pPr>
+        <w:pStyle w:val="Heading1"/>
+      </w:pPr>
+      <w:r>
+        <w:t>8 juillet 2026 — Etape 2 : fiabilisation du revenu et controle de coherence</w:t>
+      </w:r>
+    </w:p>
+    <w:p>
+      <w:pPr>
+        <w:pStyle w:val="Heading2"/>
+      </w:pPr>
+      <w:r>
+        <w:t>En une phrase</w:t>
+      </w:r>
+    </w:p>
+    <w:p>
+      <w:pPr/>
+      <w:r>
+        <w:t>Deux ameliorations. D abord on ne perd plus les revenus en dollars. Ensuite on ajoute un detecteur de contradictions internes : des chiffres credibles pris un par un mais impossibles ensemble.</w:t>
+      </w:r>
+    </w:p>
+    <w:p>
+      <w:pPr>
+        <w:pStyle w:val="Heading2"/>
+      </w:pPr>
+      <w:r>
+        <w:t>Le champ revenu, fiabilise</w:t>
+      </w:r>
+    </w:p>
+    <w:p>
+      <w:pPr>
+        <w:pStyle w:val="ListBullet"/>
+      </w:pPr>
+      <w:r>
+        <w:t>Avant : un seul champ revenue_eur, en euros. Probleme : un deck en dollars (la majorite des decks US) faisait mettre vide, car l IA refusait de convertir. Une donnee presente etait perdue pour la notation.</w:t>
+      </w:r>
+    </w:p>
+    <w:p>
+      <w:pPr>
+        <w:pStyle w:val="ListBullet"/>
+      </w:pPr>
+      <w:r>
+        <w:t>Apres : deux champs, le montant brut et la devise (USD, EUR ou GBP). L IA recopie ce qu elle voit, elle ne convertit plus. Une table de conversion en code permet de comparer les montants entre eux quand il faut.</w:t>
+      </w:r>
+    </w:p>
+    <w:p>
+      <w:pPr>
+        <w:pStyle w:val="Heading2"/>
+      </w:pPr>
+      <w:r>
+        <w:t>Le controle de coherence (la nouveaute)</w:t>
+      </w:r>
+    </w:p>
+    <w:p>
+      <w:pPr/>
+      <w:r>
+        <w:t>Un red flag classique juge un chiffre face a un seuil. Ce nouveau controle juge les chiffres les uns par rapport aux autres. C est ce qui attrape le chiffre invente mais credible isole. Trois croisements :</w:t>
+      </w:r>
+    </w:p>
+    <w:p>
+      <w:pPr>
+        <w:pStyle w:val="ListBullet"/>
+      </w:pPr>
+      <w:r>
+        <w:t>Churn contre retention (NRR) : perdre beaucoup de clients tout en gardant plus de 100% du revenu est quasi impossible sans expansion massive.</w:t>
+      </w:r>
+    </w:p>
+    <w:p>
+      <w:pPr>
+        <w:pStyle w:val="ListBullet"/>
+      </w:pPr>
+      <w:r>
+        <w:t>Churn contre croissance : ramenes au mois, si le churn depasse la croissance, la base se contracte malgre une croissance affichee.</w:t>
+      </w:r>
+    </w:p>
+    <w:p>
+      <w:pPr>
+        <w:pStyle w:val="ListBullet"/>
+      </w:pPr>
+      <w:r>
+        <w:t>Revenu contre round : un revenu tres eleve sur un tour precoce (pre-seed, seed) interroge.</w:t>
+      </w:r>
+    </w:p>
+    <w:p>
+      <w:pPr>
+        <w:pStyle w:val="ListBullet"/>
+      </w:pPr>
+      <w:r>
+        <w:t>Detail important : le churn est annualise en interet compose, pas multiplie par douze. 5% par mois font environ 46% par an, pas 60%.</w:t>
+      </w:r>
+    </w:p>
+    <w:p>
+      <w:pPr>
+        <w:pStyle w:val="Heading2"/>
+      </w:pPr>
+      <w:r>
+        <w:t>Verifie et fonctionnel</w:t>
+      </w:r>
+    </w:p>
+    <w:p>
+      <w:pPr>
+        <w:pStyle w:val="ListBullet"/>
+      </w:pPr>
+      <w:r>
+        <w:t>Les trois croisements se declenchent sur des cas fabriques, et ne se declenchent pas sur un cas sain type Buffer (40% de croissance, 5% de churn).</w:t>
+      </w:r>
+    </w:p>
+    <w:p>
+      <w:pPr>
+        <w:pStyle w:val="Heading2"/>
+      </w:pPr>
+      <w:r>
+        <w:t>Pistes notees pour plus tard</w:t>
+      </w:r>
+    </w:p>
+    <w:p>
+      <w:pPr>
+        <w:pStyle w:val="ListBullet"/>
+      </w:pPr>
+      <w:r>
+        <w:t>La paire burn contre runway n est pas encore faite : elle demande le cash disponible et la depense mensuelle, qu on n extrait pas encore.</w:t>
+      </w:r>
+    </w:p>
+    <w:p>
+      <w:pPr>
+        <w:pStyle w:val="ListBullet"/>
+      </w:pPr>
+      <w:r>
+        <w:t>Quand l IA donne un churn, elle oublie parfois la periode (mensuel ou annuel). Sans periode le chiffre est inexploitable. A durcir dans les consignes.</w:t>
+      </w:r>
+    </w:p>
+    <w:p>
+      <w:pPr>
+        <w:pStyle w:val="ListBullet"/>
+      </w:pPr>
+      <w:r>
+        <w:t>Ecrire de vrais tests automatises (installer pytest) au lieu de verifier a la main.</w:t>
+      </w:r>
+    </w:p>
+    <w:p>
+      <w:pPr>
+        <w:pStyle w:val="Heading1"/>
+      </w:pPr>
+      <w:r>
+        <w:t>8 juillet 2026 — Premier test de l extraction sur un vrai deck</w:t>
+      </w:r>
+    </w:p>
+    <w:p>
+      <w:pPr>
+        <w:pStyle w:val="Heading2"/>
+      </w:pPr>
+      <w:r>
+        <w:t>En une phrase</w:t>
+      </w:r>
+    </w:p>
+    <w:p>
+      <w:pPr/>
+      <w:r>
+        <w:t>On a lance pour la premiere fois l analyse sur un vrai pitch deck (Airbnb 2008), au lieu de chiffres inventes. Objectif : verifier que l intelligence artificielle remplit bien les 14 signaux chiffres qui nourrissent la notation.</w:t>
+      </w:r>
+    </w:p>
+    <w:p>
+      <w:pPr>
+        <w:pStyle w:val="Heading2"/>
+      </w:pPr>
+      <w:r>
+        <w:t>Ce qui a change concretement</w:t>
+      </w:r>
+    </w:p>
+    <w:p>
+      <w:pPr>
+        <w:pStyle w:val="ListBullet"/>
+      </w:pPr>
+      <w:r>
+        <w:t>Un bug bloquant a ete trouve et corrige : le modele de lecture d images de Mistral s appelait pixtral-large-latest, mais ce modele n existe plus (retire du catalogue). Tout appel en mode image plantait. Remplace par mistral-medium-latest, qui sait lire les images et consomme moins de quota.</w:t>
+      </w:r>
+    </w:p>
+    <w:p>
+      <w:pPr>
+        <w:pStyle w:val="ListBullet"/>
+      </w:pPr>
+      <w:r>
+        <w:t>Ce bug etait invisible tant qu on testait sur des chiffres fictifs : il ne se declenche que sur un vrai deck en images.</w:t>
+      </w:r>
+    </w:p>
+    <w:p>
+      <w:pPr>
+        <w:pStyle w:val="Heading2"/>
+      </w:pPr>
+      <w:r>
+        <w:t>Ce que le test a revele</w:t>
+      </w:r>
+    </w:p>
+    <w:p>
+      <w:pPr>
+        <w:pStyle w:val="ListBullet"/>
+      </w:pPr>
+      <w:r>
+        <w:t>La brique extraction fonctionne. Sur le deck Airbnb, l IA a bien detecte le round (seed) et le montant (500k USD).</w:t>
+      </w:r>
+    </w:p>
+    <w:p>
+      <w:pPr>
+        <w:pStyle w:val="ListBullet"/>
+      </w:pPr>
+      <w:r>
+        <w:t>Sur les 14 signaux, 3 sont remplis, 11 sont vides. Ce n est PAS un defaut : le deck Airbnb de 2008 est un tout premier tour sans metriques financieres. L IA met vide la ou la donnee est absente, au lieu d inventer. C est exactement le comportement voulu.</w:t>
+      </w:r>
+    </w:p>
+    <w:p>
+      <w:pPr>
+        <w:pStyle w:val="ListBullet"/>
+      </w:pPr>
+      <w:r>
+        <w:t>Le mode image (secours) s est bien declenche automatiquement, car le deck Airbnb est fait d images et le mode texte n en tire rien.</w:t>
+      </w:r>
+    </w:p>
+    <w:p>
+      <w:pPr>
+        <w:pStyle w:val="Heading2"/>
+      </w:pPr>
+      <w:r>
+        <w:t>Piste notee pour plus tard</w:t>
+      </w:r>
+    </w:p>
+    <w:p>
+      <w:pPr>
+        <w:pStyle w:val="ListBullet"/>
+      </w:pPr>
+      <w:r>
+        <w:t>Le champ equipe revient parfois sous une forme un peu brute (liste technique) qui s affiche mal. A nettoyer au moment de fabriquer le memo final.</w:t>
+      </w:r>
+    </w:p>
     <w:p>
       <w:pPr>
         <w:pStyle w:val="Heading1"/>

</xml_diff>

<commit_message>
docs: journal fiabilisation du couplage taux/unité
</commit_message>
<xml_diff>
--- a/Journal_de_bord.docx
+++ b/Journal_de_bord.docx
@@ -19,6 +19,60 @@
       </w:r>
     </w:p>
     <w:p/>
+    <w:p>
+      <w:pPr>
+        <w:pStyle w:val="Heading1"/>
+      </w:pPr>
+      <w:r>
+        <w:t>8 juillet 2026 — Fiabilisation du couplage taux / unite</w:t>
+      </w:r>
+    </w:p>
+    <w:p>
+      <w:pPr>
+        <w:pStyle w:val="Heading2"/>
+      </w:pPr>
+      <w:r>
+        <w:t>En une phrase</w:t>
+      </w:r>
+    </w:p>
+    <w:p>
+      <w:pPr/>
+      <w:r>
+        <w:t>On empeche desormais un chiffre de survivre sans son unite : un churn sans periode, un revenu sans devise. C est souvent le signe d un chiffre invente, et c est de toute facon inexploitable.</w:t>
+      </w:r>
+    </w:p>
+    <w:p>
+      <w:pPr>
+        <w:pStyle w:val="Heading2"/>
+      </w:pPr>
+      <w:r>
+        <w:t>Ce qui a change</w:t>
+      </w:r>
+    </w:p>
+    <w:p>
+      <w:pPr>
+        <w:pStyle w:val="ListBullet"/>
+      </w:pPr>
+      <w:r>
+        <w:t>Cote consigne (prompt) : on dit a l IA que taux et periode (et montant et devise) vont par paires. Soit les deux, soit aucun.</w:t>
+      </w:r>
+    </w:p>
+    <w:p>
+      <w:pPr>
+        <w:pStyle w:val="ListBullet"/>
+      </w:pPr>
+      <w:r>
+        <w:t>Cote garde-fou (code) : un controle automatique Pydantic verifie la regle a la construction. Si une seule moitie est presente, il remet les deux a vide. Il jette la donnee incomplete plutot que de deviner l unite, car deviner fausserait le jugement (5% par mois est critique, 5% par an est anodin).</w:t>
+      </w:r>
+    </w:p>
+    <w:p>
+      <w:pPr>
+        <w:pStyle w:val="ListBullet"/>
+      </w:pPr>
+      <w:r>
+        <w:t>Constat qui a motive tout ca : sur le deck Buffer, l IA sortait un churn de 5% alors que le deck n en parle pas. Un chiffre invente mais credible. Le garde-fou l elimine.</w:t>
+      </w:r>
+    </w:p>
     <w:p>
       <w:pPr>
         <w:pStyle w:val="Heading1"/>

</xml_diff>

<commit_message>
docs: journal etape 3 tranche 1 (verdict)
</commit_message>
<xml_diff>
--- a/Journal_de_bord.docx
+++ b/Journal_de_bord.docx
@@ -19,6 +19,92 @@
       </w:r>
     </w:p>
     <w:p/>
+    <w:p>
+      <w:pPr>
+        <w:pStyle w:val="Heading1"/>
+      </w:pPr>
+      <w:r>
+        <w:t>9 juillet 2026 — Etape 3 demarree : le memo d investissement (tranche 1)</w:t>
+      </w:r>
+    </w:p>
+    <w:p>
+      <w:pPr>
+        <w:pStyle w:val="Heading2"/>
+      </w:pPr>
+      <w:r>
+        <w:t>En une phrase</w:t>
+      </w:r>
+    </w:p>
+    <w:p>
+      <w:pPr/>
+      <w:r>
+        <w:t>Debut du module qui assemblera tout (extraction, scoring, critique) en un memo d investissement exportable en Word. On a d abord ecrit la specification, puis la premiere brique : le verdict.</w:t>
+      </w:r>
+    </w:p>
+    <w:p>
+      <w:pPr>
+        <w:pStyle w:val="Heading2"/>
+      </w:pPr>
+      <w:r>
+        <w:t>Un ecart important corrige au demarrage</w:t>
+      </w:r>
+    </w:p>
+    <w:p>
+      <w:pPr>
+        <w:pStyle w:val="ListBullet"/>
+      </w:pPr>
+      <w:r>
+        <w:t>La consigne de depart supposait des briques qui n existent pas encore (sources de slide, objet de critique par IA, benchmarks en donnees). On a fait le choix d adapter et de degrader proprement : construire le memo avec ce qu on a, et noter le reste comme dette. Une specification honnete a ete ecrite dans docs/structure_memo.md, elle fait foi.</w:t>
+      </w:r>
+    </w:p>
+    <w:p>
+      <w:pPr>
+        <w:pStyle w:val="Heading2"/>
+      </w:pPr>
+      <w:r>
+        <w:t>Le principe d architecture retenu</w:t>
+      </w:r>
+    </w:p>
+    <w:p>
+      <w:pPr>
+        <w:pStyle w:val="ListBullet"/>
+      </w:pPr>
+      <w:r>
+        <w:t>Un agregat (MemoData) fait tous les calculs. Deux mises en forme (Markdown, Word) ne font qu afficher, sans jamais calculer. Analogie : l onglet de calcul du modele, et ses mises en page d impression. Le Word n est pas une conversion du Markdown, les deux lisent le meme agregat.</w:t>
+      </w:r>
+    </w:p>
+    <w:p>
+      <w:pPr>
+        <w:pStyle w:val="Heading2"/>
+      </w:pPr>
+      <w:r>
+        <w:t>Ce qui marche (tranche 1)</w:t>
+      </w:r>
+    </w:p>
+    <w:p>
+      <w:pPr>
+        <w:pStyle w:val="ListBullet"/>
+      </w:pPr>
+      <w:r>
+        <w:t>Une config de seuils dans un fichier JSON, validee au chargement (seuil bas &lt; seuil haut, grades coherents). Les seuils ne sont jamais codes en dur.</w:t>
+      </w:r>
+    </w:p>
+    <w:p>
+      <w:pPr>
+        <w:pStyle w:val="ListBullet"/>
+      </w:pPr>
+      <w:r>
+        <w:t>Le verdict : PASSER, APPROFONDIR ou POURSUIVRE, calcule par du code pur selon le score et les red flags. Convention choisie : un score pile sur un seuil penche vers APPROFONDIR (le prudent).</w:t>
+      </w:r>
+    </w:p>
+    <w:p>
+      <w:pPr>
+        <w:pStyle w:val="ListBullet"/>
+      </w:pPr>
+      <w:r>
+        <w:t>Premiers vrais tests automatises : installation de pytest, 9 tests qui passent (les trois verdicts, les bornes exactes, les configs invalides).</w:t>
+      </w:r>
+    </w:p>
     <w:p>
       <w:pPr>
         <w:pStyle w:val="Heading1"/>

</xml_diff>

<commit_message>
feat(output): tranche 2 - modeles MemoData + recommandation deterministe
- Sous-modeles Pydantic complets du memo (Reason, KeyQuestion, DashboardRow,
  RedFlagRow, DimensionSection, MissingData, ReviewBlock, Annexes, MemoData).
- Config etendue : attendus_par_round (signaux typos par stade, source §5.4)
  et questions_referentiel (questions d'analyste copiees, par round/dimension).
- select_forces / select_faiblesses / select_question_decisive : selection
  deterministe et testee. build_memo_data reste un stub (NotImplementedError)
  tant que toutes les sections n'existent pas.
- 8 tests recommandation + config-validation robustifiee. 17 tests verts.
</commit_message>
<xml_diff>
--- a/Journal_de_bord.docx
+++ b/Journal_de_bord.docx
@@ -19,6 +19,84 @@
       </w:r>
     </w:p>
     <w:p/>
+    <w:p>
+      <w:pPr>
+        <w:pStyle w:val="Heading1"/>
+      </w:pPr>
+      <w:r>
+        <w:t>11 juillet 2026 — Etape 3 tranche 2 : la recommandation du memo</w:t>
+      </w:r>
+    </w:p>
+    <w:p>
+      <w:pPr>
+        <w:pStyle w:val="Heading2"/>
+      </w:pPr>
+      <w:r>
+        <w:t>En une phrase</w:t>
+      </w:r>
+    </w:p>
+    <w:p>
+      <w:pPr/>
+      <w:r>
+        <w:t>Le memo sait maintenant choisir, tout seul et de facon reproductible, les 3 forces, les 3 faiblesses et la seule question a poser aux fondateurs. Aucun appel a l'IA : ce sont des regles fixes.</w:t>
+      </w:r>
+    </w:p>
+    <w:p>
+      <w:pPr>
+        <w:pStyle w:val="Heading2"/>
+      </w:pPr>
+      <w:r>
+        <w:t>Ce qui a change concretement</w:t>
+      </w:r>
+    </w:p>
+    <w:p>
+      <w:pPr/>
+      <w:r>
+        <w:t>Definition de la structure complete du memo : toutes les cases, chacune avec un type impose. Si une case obligatoire manque, le programme refuse de produire un memo faux. Ajout dans la config des questions d'analyste (copiees du referentiel, classees par round et par dimension) et des donnees attendues par stade. Trois fonctions de tri deterministe : les forces (meilleures dimensions du round), les faiblesses (d'abord les alertes graves, puis les dimensions faibles) et la question decisive (une alerte critique en priorite, sinon une donnee importante manquante, sinon la dimension la plus faible).</w:t>
+      </w:r>
+    </w:p>
+    <w:p>
+      <w:pPr>
+        <w:pStyle w:val="Heading2"/>
+      </w:pPr>
+      <w:r>
+        <w:t>Un choix assume</w:t>
+      </w:r>
+    </w:p>
+    <w:p>
+      <w:pPr/>
+      <w:r>
+        <w:t>La fonction qui assemble le memo complet reste volontairement en construction : elle refuse de tourner tant que toutes les sections n'existent pas. On prefere une erreur claire a un memo a moitie rempli. Les briques deja pretes sont testees une par une.</w:t>
+      </w:r>
+    </w:p>
+    <w:p>
+      <w:pPr>
+        <w:pStyle w:val="Heading2"/>
+      </w:pPr>
+      <w:r>
+        <w:t>Verifie et fonctionnel</w:t>
+      </w:r>
+    </w:p>
+    <w:p>
+      <w:pPr/>
+      <w:r>
+        <w:t>17 tests automatiques passent, dont 8 nouveaux : tri des forces avec cas d'egalite, priorite des faiblesses, et les 3 regles de la question decisive.</w:t>
+      </w:r>
+    </w:p>
+    <w:p>
+      <w:pPr>
+        <w:pStyle w:val="Heading2"/>
+      </w:pPr>
+      <w:r>
+        <w:t>Note pour plus tard</w:t>
+      </w:r>
+    </w:p>
+    <w:p>
+      <w:pPr/>
+      <w:r>
+        <w:t>Les bonnes et mauvaises reponses aux questions restent a rediger a la main (le code ne les invente jamais). Les donnees attendues ne couvrent pour l'instant que les chiffres extraits de facon structuree.</w:t>
+      </w:r>
+    </w:p>
     <w:p>
       <w:pPr>
         <w:pStyle w:val="Heading1"/>

</xml_diff>

<commit_message>
feat(output): tranche 3 - render_markdown sections 0-1-2 + golden test
- src/output/render_markdown.py : mise en forme pure (aucun calcul). Helpers
  par section : en-tete, verdict, recommandation, tableau de bord (table md).
- Statuts du dashboard traduits en francais a l'affichage seulement.
- tests/test_render_markdown.py + tests/golden/memo_min.md : golden test qui
  fige la sortie et compare caractere par caractere. 18 tests verts.
</commit_message>
<xml_diff>
--- a/Journal_de_bord.docx
+++ b/Journal_de_bord.docx
@@ -19,6 +19,84 @@
       </w:r>
     </w:p>
     <w:p/>
+    <w:p>
+      <w:pPr>
+        <w:pStyle w:val="Heading1"/>
+      </w:pPr>
+      <w:r>
+        <w:t>12 juillet 2026 — Etape 3 tranche 3 : le memo en Markdown (sections 0 a 2)</w:t>
+      </w:r>
+    </w:p>
+    <w:p>
+      <w:pPr>
+        <w:pStyle w:val="Heading2"/>
+      </w:pPr>
+      <w:r>
+        <w:t>En une phrase</w:t>
+      </w:r>
+    </w:p>
+    <w:p>
+      <w:pPr/>
+      <w:r>
+        <w:t>Le memo sait maintenant s'ecrire en Markdown pour ses trois premieres parties : le verdict, la recommandation (forces, faiblesses, question), et le tableau de bord.</w:t>
+      </w:r>
+    </w:p>
+    <w:p>
+      <w:pPr>
+        <w:pStyle w:val="Heading2"/>
+      </w:pPr>
+      <w:r>
+        <w:t>Ce qui a change concretement</w:t>
+      </w:r>
+    </w:p>
+    <w:p>
+      <w:pPr/>
+      <w:r>
+        <w:t>Un module de rendu qui ne fait que de la mise en page : il ne calcule rien, il affiche ce qui a deja ete decide en amont. Titres, listes, et un vrai tableau Markdown pour le tableau de bord. Une regle stricte : toute donnee affichee vient de l'agregat du memo, jamais d'un calcul dans la mise en page.</w:t>
+      </w:r>
+    </w:p>
+    <w:p>
+      <w:pPr>
+        <w:pStyle w:val="Heading2"/>
+      </w:pPr>
+      <w:r>
+        <w:t>Le garde-fou mis en place</w:t>
+      </w:r>
+    </w:p>
+    <w:p>
+      <w:pPr/>
+      <w:r>
+        <w:t>Un 'golden test' : on fige une sortie de reference dans un fichier temoin, et le test compare caractere par caractere. Si un jour la mise en page change sans qu'on l'ait voulu, le test casse et nous previent. Analogie : une photo certifiee du resultat attendu.</w:t>
+      </w:r>
+    </w:p>
+    <w:p>
+      <w:pPr>
+        <w:pStyle w:val="Heading2"/>
+      </w:pPr>
+      <w:r>
+        <w:t>Verifie et fonctionnel</w:t>
+      </w:r>
+    </w:p>
+    <w:p>
+      <w:pPr/>
+      <w:r>
+        <w:t>18 tests automatiques passent, dont le nouveau golden test du rendu Markdown.</w:t>
+      </w:r>
+    </w:p>
+    <w:p>
+      <w:pPr>
+        <w:pStyle w:val="Heading2"/>
+      </w:pPr>
+      <w:r>
+        <w:t>Prochaine etape</w:t>
+      </w:r>
+    </w:p>
+    <w:p>
+      <w:pPr/>
+      <w:r>
+        <w:t>Rendre les sections suivantes (analyse par dimension, red flags, donnees manquantes) et remplir le tableau de bord depuis les vrais signaux.</w:t>
+      </w:r>
+    </w:p>
     <w:p>
       <w:pPr>
         <w:pStyle w:val="Heading1"/>

</xml_diff>

<commit_message>
feat(output): tranche 4 - sections 2 a 5 (dashboard, dimensions, red flags, manquantes)
- config : benchmarks_par_round (bornes top/norme alignees sur analysis.py),
  BenchmarkBand (sens deduit de l'ordre des bornes).
- memo_data : build_dashboard (+ formatage valeurs, statut, garde-fou churn
  mensuel), build_dimensions (ordre poids decroissant, red flags inline),
  build_red_flag_rows (tri severite, incoherences), build_missing_data
  (justification ancree referentiel §1.1), _grade_for.
- render_markdown : rendu des sections 3-4-5. Golden test etendu.
- 7 tests builders. 25 tests verts. build_memo_data toujours stub.
</commit_message>
<xml_diff>
--- a/Journal_de_bord.docx
+++ b/Journal_de_bord.docx
@@ -19,6 +19,76 @@
       </w:r>
     </w:p>
     <w:p/>
+    <w:p>
+      <w:pPr>
+        <w:pStyle w:val="Heading1"/>
+      </w:pPr>
+      <w:r>
+        <w:t>12 juillet 2026 — Etape 3 tranche 4 : tableau de bord, dimensions, red flags, donnees manquantes</w:t>
+      </w:r>
+    </w:p>
+    <w:p>
+      <w:pPr>
+        <w:pStyle w:val="Heading2"/>
+      </w:pPr>
+      <w:r>
+        <w:t>En une phrase</w:t>
+      </w:r>
+    </w:p>
+    <w:p>
+      <w:pPr/>
+      <w:r>
+        <w:t>Le memo sait maintenant construire et afficher quatre sections de plus : le tableau de bord chiffre, l'analyse par dimension, la liste des alertes (red flags) et les donnees attendues qui manquent.</w:t>
+      </w:r>
+    </w:p>
+    <w:p>
+      <w:pPr>
+        <w:pStyle w:val="Heading2"/>
+      </w:pPr>
+      <w:r>
+        <w:t>Ce qui a change concretement</w:t>
+      </w:r>
+    </w:p>
+    <w:p>
+      <w:pPr/>
+      <w:r>
+        <w:t>Le tableau de bord compare chaque chiffre du deck a un repere de marche (benchmark) et le classe : top quartile, dans la norme, sous la barre, absent, ou non evaluable quand aucun repere n'existe. Les reperes sont volontairement alignes sur les seuils deja utilises par la notation, pour que le memo reflete la mecanique reelle et non des chiffres inventes. Le sens de comparaison (plus bas ou plus haut = mieux) se deduit tout seul de l'ordre des bornes.</w:t>
+      </w:r>
+    </w:p>
+    <w:p>
+      <w:pPr/>
+      <w:r>
+        <w:t>L'analyse par dimension classe les dimensions par poids du round (la traction ouvre en serie A) avec leur note, leur grade et les alertes rattachees. Les red flags sont tries du plus grave au moins grave, et les incoherences internes sont reperees a part. Les donnees manquantes citent la doctrine du referentiel (l'absence d'une donnee est un signal), sans jamais fabriquer de jugement.</w:t>
+      </w:r>
+    </w:p>
+    <w:p>
+      <w:pPr>
+        <w:pStyle w:val="Heading2"/>
+      </w:pPr>
+      <w:r>
+        <w:t>Verifie et fonctionnel</w:t>
+      </w:r>
+    </w:p>
+    <w:p>
+      <w:pPr/>
+      <w:r>
+        <w:t>25 tests automatiques passent, dont 7 nouveaux et le golden test du rendu Markdown mis a jour pour couvrir les nouvelles sections.</w:t>
+      </w:r>
+    </w:p>
+    <w:p>
+      <w:pPr>
+        <w:pStyle w:val="Heading2"/>
+      </w:pPr>
+      <w:r>
+        <w:t>Prochaine etape</w:t>
+      </w:r>
+    </w:p>
+    <w:p>
+      <w:pPr/>
+      <w:r>
+        <w:t>Les deux dernieres sections (contre-analyse en mode indisponible, questions aux fondateurs), puis l'export Word et le branchement final.</w:t>
+      </w:r>
+    </w:p>
     <w:p>
       <w:pPr>
         <w:pStyle w:val="Heading1"/>

</xml_diff>

<commit_message>
feat(output): tranche 5 - contre-analyse (degradee) et questions fondateurs
- memo_data : build_review_block (mode indisponible par defaut, bandeaux fixes)
  et build_founder_questions (top 5 : red flags > donnees manquantes > questions
  d'analyste du round, dedup par texte).
- render_markdown : sections 6 (encart blockquote) et 7 (liste numerotee).
- Golden test etendu + test de degradation. 29 tests verts.
</commit_message>
<xml_diff>
--- a/Journal_de_bord.docx
+++ b/Journal_de_bord.docx
@@ -19,6 +19,76 @@
       </w:r>
     </w:p>
     <w:p/>
+    <w:p>
+      <w:pPr>
+        <w:pStyle w:val="Heading1"/>
+      </w:pPr>
+      <w:r>
+        <w:t>12 juillet 2026 — Etape 3 tranche 5 : contre-analyse et questions aux fondateurs</w:t>
+      </w:r>
+    </w:p>
+    <w:p>
+      <w:pPr>
+        <w:pStyle w:val="Heading2"/>
+      </w:pPr>
+      <w:r>
+        <w:t>En une phrase</w:t>
+      </w:r>
+    </w:p>
+    <w:p>
+      <w:pPr/>
+      <w:r>
+        <w:t>Les deux dernieres sections de contenu du memo sont la : la contre-analyse (pour l'instant en mode indisponible) et les cinq questions a poser aux fondateurs.</w:t>
+      </w:r>
+    </w:p>
+    <w:p>
+      <w:pPr>
+        <w:pStyle w:val="Heading2"/>
+      </w:pPr>
+      <w:r>
+        <w:t>Ce qui a change concretement</w:t>
+      </w:r>
+    </w:p>
+    <w:p>
+      <w:pPr/>
+      <w:r>
+        <w:t>La contre-analyse critique par IA n'existe pas encore comme brique. Plutot que d'inventer un faux objet, le memo affiche un encart honnete : contre-analyse indisponible. Le memo se genere quand meme. Le jour ou la brique existera, il suffira de lui passer le texte et le bandeau basculera automatiquement (avec l'avertissement : critique generee par IA, non integree au score, non reproductible).</w:t>
+      </w:r>
+    </w:p>
+    <w:p>
+      <w:pPr/>
+      <w:r>
+        <w:t>Les questions aux fondateurs sont selectionnees par priorite : d'abord celles liees aux alertes graves, puis aux donnees manquantes, puis les questions d'analyste du round, sans doublon, limitees a cinq. Les questions sont copiees du referentiel ; les bonnes et mauvaises reponses restent a rediger a la main.</w:t>
+      </w:r>
+    </w:p>
+    <w:p>
+      <w:pPr>
+        <w:pStyle w:val="Heading2"/>
+      </w:pPr>
+      <w:r>
+        <w:t>Verifie et fonctionnel</w:t>
+      </w:r>
+    </w:p>
+    <w:p>
+      <w:pPr/>
+      <w:r>
+        <w:t>29 tests automatiques passent, dont 4 nouveaux : les deux modes de la contre-analyse, la selection des questions, et un test qui verifie que l'encart degrade s'affiche bien sans fuite de contenu.</w:t>
+      </w:r>
+    </w:p>
+    <w:p>
+      <w:pPr>
+        <w:pStyle w:val="Heading2"/>
+      </w:pPr>
+      <w:r>
+        <w:t>Prochaine etape</w:t>
+      </w:r>
+    </w:p>
+    <w:p>
+      <w:pPr/>
+      <w:r>
+        <w:t>L'export Word (docx) du memo complet, puis le branchement de bout en bout depuis le PDF.</w:t>
+      </w:r>
+    </w:p>
     <w:p>
       <w:pPr>
         <w:pStyle w:val="Heading1"/>

</xml_diff>

<commit_message>
feat(output): section 8 (annexes) + assemblage complet de build_memo_data
- build_annexes : methodologie (mecanique scoring lue depuis analysis.py),
  limites assumees, extraction_brute = deck.model_dump().
- build_memo_data sort du stub : orchestre les sous-fonctions testees, Pydantic
  valide la completude. Params review (texte, None par defaut) et societe.
- render_markdown : section 8 (annexes). Golden test etendu.
- 2 tests d'integration bout en bout. 31 tests verts.
</commit_message>
<xml_diff>
--- a/Journal_de_bord.docx
+++ b/Journal_de_bord.docx
@@ -19,6 +19,70 @@
       </w:r>
     </w:p>
     <w:p/>
+    <w:p>
+      <w:pPr>
+        <w:pStyle w:val="Heading1"/>
+      </w:pPr>
+      <w:r>
+        <w:t>12 juillet 2026 — Etape 3 : annexes et assemblage complet du memo</w:t>
+      </w:r>
+    </w:p>
+    <w:p>
+      <w:pPr>
+        <w:pStyle w:val="Heading2"/>
+      </w:pPr>
+      <w:r>
+        <w:t>En une phrase</w:t>
+      </w:r>
+    </w:p>
+    <w:p>
+      <w:pPr/>
+      <w:r>
+        <w:t>Le memo est desormais assemble de bout en bout : une seule fonction prend les trois couches (extraction, scoring, config) et produit le memo complet, annexes comprises.</w:t>
+      </w:r>
+    </w:p>
+    <w:p>
+      <w:pPr>
+        <w:pStyle w:val="Heading2"/>
+      </w:pPr>
+      <w:r>
+        <w:t>Ce qui a change concretement</w:t>
+      </w:r>
+    </w:p>
+    <w:p>
+      <w:pPr/>
+      <w:r>
+        <w:t>Ajout des annexes : la methodologie (les trois couches et la mecanique de notation reellement appliquee, lue directement dans le code de scoring et non recopiee), les limites assumees, et l'extraction brute du deck. Puis la fonction d'assemblage est sortie de son etat 'en construction' : elle orchestre les sous-fonctions deja testees et laisse la validation verifier qu'aucune section requise ne manque. Si une case obligatoire manquait, le programme refuserait de produire un memo au lieu d'en sortir un faux.</w:t>
+      </w:r>
+    </w:p>
+    <w:p>
+      <w:pPr>
+        <w:pStyle w:val="Heading2"/>
+      </w:pPr>
+      <w:r>
+        <w:t>Verifie et fonctionnel</w:t>
+      </w:r>
+    </w:p>
+    <w:p>
+      <w:pPr/>
+      <w:r>
+        <w:t>31 tests automatiques passent, dont 2 nouveaux tests de bout en bout : un memo complet est construit puis mis en page sans erreur, dans les deux modes (avec et sans contre-analyse). Un rendu reel a ete relu a l'ecran pour verifier la coherence.</w:t>
+      </w:r>
+    </w:p>
+    <w:p>
+      <w:pPr>
+        <w:pStyle w:val="Heading2"/>
+      </w:pPr>
+      <w:r>
+        <w:t>Prochaine etape</w:t>
+      </w:r>
+    </w:p>
+    <w:p>
+      <w:pPr/>
+      <w:r>
+        <w:t>L'export Word (docx) du memo, avec tableaux natifs et encadre pour la contre-analyse, puis le branchement final depuis le PDF.</w:t>
+      </w:r>
+    </w:p>
     <w:p>
       <w:pPr>
         <w:pStyle w:val="Heading1"/>

</xml_diff>

<commit_message>
feat(output): tranche 6 - render_docx (export Word)
- src/output/render_docx.py : mise en forme Word pure lisant MemoData (pas une
  conversion du markdown). Tableaux natifs pour §2 et §4, encadre grise (w:shd)
  pour la contre-analyse §6, nom memo_{societe}_{date}.docx dans output/.
- Gestion d'erreur d'ecriture explicite (OSError -> message clair).
- tests/test_render_docx.py : creation, relecture structure, 2 tableaux,
  bandeau et fond grise. 33 tests verts.
</commit_message>
<xml_diff>
--- a/Journal_de_bord.docx
+++ b/Journal_de_bord.docx
@@ -19,6 +19,70 @@
       </w:r>
     </w:p>
     <w:p/>
+    <w:p>
+      <w:pPr>
+        <w:pStyle w:val="Heading1"/>
+      </w:pPr>
+      <w:r>
+        <w:t>12 juillet 2026 — Etape 3 tranche 6 : export Word du memo</w:t>
+      </w:r>
+    </w:p>
+    <w:p>
+      <w:pPr>
+        <w:pStyle w:val="Heading2"/>
+      </w:pPr>
+      <w:r>
+        <w:t>En une phrase</w:t>
+      </w:r>
+    </w:p>
+    <w:p>
+      <w:pPr/>
+      <w:r>
+        <w:t>Le memo s'exporte maintenant en fichier Word (.docx), avec de vrais tableaux et un encadre grise pour la contre-analyse.</w:t>
+      </w:r>
+    </w:p>
+    <w:p>
+      <w:pPr>
+        <w:pStyle w:val="Heading2"/>
+      </w:pPr>
+      <w:r>
+        <w:t>Ce qui a change concretement</w:t>
+      </w:r>
+    </w:p>
+    <w:p>
+      <w:pPr/>
+      <w:r>
+        <w:t>Un second module de mise en page, en parallele du Markdown. Point important : le Word n'est pas une conversion du Markdown, les deux lisent la meme source (le memo assemble). C'est la garantie qu'aucune difference de contenu ne se glisse entre les deux formats. Tableaux Word natifs pour le tableau de bord et les red flags, encadre grise pour la contre-analyse (obtenu en posant directement l'attribut de fond dans le format du document). Le fichier est nomme automatiquement memo_societe_date.docx et range dans le dossier de sortie.</w:t>
+      </w:r>
+    </w:p>
+    <w:p>
+      <w:pPr>
+        <w:pStyle w:val="Heading2"/>
+      </w:pPr>
+      <w:r>
+        <w:t>Verifie et fonctionnel</w:t>
+      </w:r>
+    </w:p>
+    <w:p>
+      <w:pPr/>
+      <w:r>
+        <w:t>33 tests automatiques passent, dont 2 nouveaux : le fichier Word se cree et se relit, il contient bien deux tableaux, le bandeau de contre-analyse et son fond grise. On ne compare pas le binaire, on relit la structure.</w:t>
+      </w:r>
+    </w:p>
+    <w:p>
+      <w:pPr>
+        <w:pStyle w:val="Heading2"/>
+      </w:pPr>
+      <w:r>
+        <w:t>Prochaine etape</w:t>
+      </w:r>
+    </w:p>
+    <w:p>
+      <w:pPr/>
+      <w:r>
+        <w:t>Le branchement final en ligne de commande : PDF, extraction, scoring, memo, ecriture des deux fichiers.</w:t>
+      </w:r>
+    </w:p>
     <w:p>
       <w:pPr>
         <w:pStyle w:val="Heading1"/>

</xml_diff>

<commit_message>
feat(cli): tranche 7 - branchement complet PDF -> memo (Markdown + Word)
- src/main.py reecrit : pipeline ingestion -> extraction -> scoring -> memo,
  ecriture des deux fichiers. Partie deterministe (build_and_write_memo) isolee
  et testable sans LLM. Gestion d'erreurs par frontiere + codes de sortie.
- render_markdown : nommage de sortie partage (output_path) + write_markdown.
  render_docx aligne dessus (fin de la duplication).
- 1 test pipeline deterministe. 34 tests verts. Etape 3 terminee.
</commit_message>
<xml_diff>
--- a/Journal_de_bord.docx
+++ b/Journal_de_bord.docx
@@ -19,6 +19,70 @@
       </w:r>
     </w:p>
     <w:p/>
+    <w:p>
+      <w:pPr>
+        <w:pStyle w:val="Heading1"/>
+      </w:pPr>
+      <w:r>
+        <w:t>12 juillet 2026 — Etape 3 tranche 7 : branchement final en ligne de commande</w:t>
+      </w:r>
+    </w:p>
+    <w:p>
+      <w:pPr>
+        <w:pStyle w:val="Heading2"/>
+      </w:pPr>
+      <w:r>
+        <w:t>En une phrase</w:t>
+      </w:r>
+    </w:p>
+    <w:p>
+      <w:pPr/>
+      <w:r>
+        <w:t>Le logiciel fait maintenant tout le trajet en une commande : on lui donne un PDF, il rend deux memos (Markdown et Word) dans le dossier de sortie.</w:t>
+      </w:r>
+    </w:p>
+    <w:p>
+      <w:pPr>
+        <w:pStyle w:val="Heading2"/>
+      </w:pPr>
+      <w:r>
+        <w:t>Ce qui a change concretement</w:t>
+      </w:r>
+    </w:p>
+    <w:p>
+      <w:pPr/>
+      <w:r>
+        <w:t>L'ancien point d'entree etait perime : il ne recuperait plus les signaux chiffres depuis l'ajout de l'etape 2. Il est reecrit au complet et enchaine les quatre etapes : lire le PDF, extraire via l'IA, noter de facon deterministe, assembler et ecrire le memo. La partie sans IA (notation, memo, ecriture) est isolee dans une fonction a part pour pouvoir la tester de bout en bout sans consommer le quota d'API. Chaque frontiere a sa gestion d'erreur : fichier introuvable, echec d'appel externe, echec d'ecriture, avec un message clair et un code de sortie non nul.</w:t>
+      </w:r>
+    </w:p>
+    <w:p>
+      <w:pPr>
+        <w:pStyle w:val="Heading2"/>
+      </w:pPr>
+      <w:r>
+        <w:t>Verifie et fonctionnel</w:t>
+      </w:r>
+    </w:p>
+    <w:p>
+      <w:pPr/>
+      <w:r>
+        <w:t>34 tests automatiques passent, dont un nouveau qui verifie que les deux fichiers sont bien ecrits avec le meme nom. Les chemins d'erreur du CLI ont ete testes a la main (sans argument, fichier absent, mauvaise extension) : messages clairs et sortie en erreur. Le trajet complet avec l'IA n'est pas teste automatiquement car il demande une cle et le reseau, mais toute la partie deterministe l'est.</w:t>
+      </w:r>
+    </w:p>
+    <w:p>
+      <w:pPr>
+        <w:pStyle w:val="Heading2"/>
+      </w:pPr>
+      <w:r>
+        <w:t>Ou en est le projet</w:t>
+      </w:r>
+    </w:p>
+    <w:p>
+      <w:pPr/>
+      <w:r>
+        <w:t>L'etape 3 (le module de sortie, le memo d'investissement) est terminee : contenu complet, deux formats d'export, branchement de bout en bout. Prochaines etapes possibles : le RAG sur les cours VC, puis le raisonnement cap table et dilution.</w:t>
+      </w:r>
+    </w:p>
     <w:p>
       <w:pPr>
         <w:pStyle w:val="Heading1"/>

</xml_diff>

<commit_message>
feat(rag): phase 3 - pipeline indexation + recherche des cours VC
- src/rag/documents.py : lecture md/txt/pdf + decoupage en passages par section.
- src/rag/index.py : build_index (reconstruction complete) et search (top-k par
  similarite) via ChromaDB, embedding_function injectable (ONNX local par defaut,
  faux embedding en test pour tourner hors ligne).
- tests : chunking, lecture de dossier, index+search offline. 38 tests verts.
- Verifie en reel : 71 passages indexes sur le referentiel, recherche pertinente.
</commit_message>
<xml_diff>
--- a/Journal_de_bord.docx
+++ b/Journal_de_bord.docx
@@ -19,6 +19,98 @@
       </w:r>
     </w:p>
     <w:p/>
+    <w:p>
+      <w:pPr>
+        <w:pStyle w:val="Heading1"/>
+      </w:pPr>
+      <w:r>
+        <w:t>15 juillet 2026 — Phase 3 : demarrage du RAG (indexation des cours VC)</w:t>
+      </w:r>
+    </w:p>
+    <w:p>
+      <w:pPr>
+        <w:pStyle w:val="Heading2"/>
+      </w:pPr>
+      <w:r>
+        <w:t>En une phrase</w:t>
+      </w:r>
+    </w:p>
+    <w:p>
+      <w:pPr/>
+      <w:r>
+        <w:t>Le logiciel sait maintenant indexer des documents de cours en local et retrouver les passages les plus pertinents pour une question, sans aucune API et sans cout.</w:t>
+      </w:r>
+    </w:p>
+    <w:p>
+      <w:pPr>
+        <w:pStyle w:val="Heading2"/>
+      </w:pPr>
+      <w:r>
+        <w:t>De quoi il s agit</w:t>
+      </w:r>
+    </w:p>
+    <w:p>
+      <w:pPr/>
+      <w:r>
+        <w:t>Le RAG (retrieval augmented generation) sert a retrouver, dans tes cours, les passages utiles pour analyser un deck. Le principe : un embedding transforme le sens d un texte en coordonnees ; deux passages proches par le sens se retrouvent proches dans la base. On interroge la base avec une question et elle rend les voisins les plus proches. C est un screener applique a du texte.</w:t>
+      </w:r>
+    </w:p>
+    <w:p>
+      <w:pPr>
+        <w:pStyle w:val="Heading2"/>
+      </w:pPr>
+      <w:r>
+        <w:t>Ce qui a change concretement</w:t>
+      </w:r>
+    </w:p>
+    <w:p>
+      <w:pPr/>
+      <w:r>
+        <w:t>Installation de ChromaDB, une base vectorielle qui tourne 100% en local. Creation d un dossier courses ou deposer les supports de cours (le contenu n est pas envoye sur git, c est personnel). Un module qui lit les documents (md, txt, pdf), les decoupe en passages courts rattaches a leur section, les transforme en vecteurs et les range dans la base. Une fonction de recherche qui rend les passages les plus proches d une question. Choix technique assume : moteur d embeddings ONNX integre a ChromaDB plutot que sentence-transformers, pour eviter d installer torch (tres lourd), tout en restant local et gratuit. Le modele (un petit MiniLM) se telecharge une seule fois puis marche hors ligne.</w:t>
+      </w:r>
+    </w:p>
+    <w:p>
+      <w:pPr>
+        <w:pStyle w:val="Heading2"/>
+      </w:pPr>
+      <w:r>
+        <w:t>Verifie et fonctionnel</w:t>
+      </w:r>
+    </w:p>
+    <w:p>
+      <w:pPr/>
+      <w:r>
+        <w:t>38 tests automatiques passent, dont 4 nouveaux. La partie indexation et recherche est testee hors ligne avec un faux embedding, pour ne pas dependre du reseau. Verifie aussi en reel sur le referentiel : 71 passages indexes, une question sur le burn multiple remonte bien les passages sur l efficacite du capital.</w:t>
+      </w:r>
+    </w:p>
+    <w:p>
+      <w:pPr>
+        <w:pStyle w:val="Heading2"/>
+      </w:pPr>
+      <w:r>
+        <w:t>Comment l utiliser</w:t>
+      </w:r>
+    </w:p>
+    <w:p>
+      <w:pPr/>
+      <w:r>
+        <w:t>Deposer les fichiers de cours dans le dossier courses, puis relancer l indexation. Au demarrage, le referentiel de criteres sert de corpus d amorcage.</w:t>
+      </w:r>
+    </w:p>
+    <w:p>
+      <w:pPr>
+        <w:pStyle w:val="Heading2"/>
+      </w:pPr>
+      <w:r>
+        <w:t>Prochaine etape</w:t>
+      </w:r>
+    </w:p>
+    <w:p>
+      <w:pPr/>
+      <w:r>
+        <w:t>Brancher la recuperation dans le memo : citer la doctrine pertinente en face de chaque dimension ou de chaque alerte.</w:t>
+      </w:r>
+    </w:p>
     <w:p>
       <w:pPr>
         <w:pStyle w:val="Heading1"/>

</xml_diff>